<commit_message>
Creación de la retrospectiva con el diseño de los ciclos restantes.
</commit_message>
<xml_diff>
--- a/RETROSPECTIVA.docx
+++ b/RETROSPECTIVA.docx
@@ -627,19 +627,1004 @@
     </w:p>
     <w:p>
       <w:pPr>
-        <w:rPr>
-          <w:lang w:val="es-MX"/>
-        </w:rPr>
-      </w:pPr>
+        <w:ind w:left="720" w:hanging="360"/>
+        <w:jc w:val="center"/>
+        <w:rPr>
+          <w:sz w:val="56"/>
+          <w:szCs w:val="56"/>
+        </w:rPr>
+      </w:pPr>
+      <w:r>
+        <w:rPr>
+          <w:sz w:val="56"/>
+          <w:szCs w:val="56"/>
+        </w:rPr>
+        <w:t xml:space="preserve">RETROSPECTIVA </w:t>
+      </w:r>
+      <w:r>
+        <w:rPr>
+          <w:sz w:val="56"/>
+          <w:szCs w:val="56"/>
+        </w:rPr>
+        <w:t>#2</w:t>
+      </w:r>
+    </w:p>
+    <w:p>
+      <w:pPr>
+        <w:rPr>
+          <w:b/>
+          <w:lang w:val="es-MX"/>
+        </w:rPr>
+      </w:pPr>
+    </w:p>
+    <w:p>
+      <w:pPr>
+        <w:pStyle w:val="Prrafodelista"/>
+        <w:widowControl/>
+        <w:numPr>
+          <w:ilvl w:val="0"/>
+          <w:numId w:val="5"/>
+        </w:numPr>
+        <w:autoSpaceDE/>
+        <w:autoSpaceDN/>
+        <w:spacing w:after="160" w:line="278" w:lineRule="auto"/>
+        <w:rPr>
+          <w:lang w:val="es-MX"/>
+        </w:rPr>
+      </w:pPr>
+      <w:r>
+        <w:rPr>
+          <w:b/>
+          <w:bCs/>
+          <w:lang w:val="es-MX"/>
+        </w:rPr>
+        <w:t xml:space="preserve">¿Cuáles fueron los </w:t>
+      </w:r>
+      <w:proofErr w:type="spellStart"/>
+      <w:r>
+        <w:rPr>
+          <w:b/>
+          <w:bCs/>
+          <w:lang w:val="es-MX"/>
+        </w:rPr>
+        <w:t>mini-ciclos</w:t>
+      </w:r>
+      <w:proofErr w:type="spellEnd"/>
+      <w:r>
+        <w:rPr>
+          <w:b/>
+          <w:bCs/>
+          <w:lang w:val="es-MX"/>
+        </w:rPr>
+        <w:t xml:space="preserve"> definidos? </w:t>
+      </w:r>
+      <w:proofErr w:type="spellStart"/>
+      <w:r>
+        <w:rPr>
+          <w:b/>
+          <w:bCs/>
+          <w:lang w:val="es-MX"/>
+        </w:rPr>
+        <w:t>Justifiquelos</w:t>
+      </w:r>
+      <w:proofErr w:type="spellEnd"/>
+    </w:p>
+    <w:p>
+      <w:pPr>
+        <w:pStyle w:val="Prrafodelista"/>
+        <w:widowControl/>
+        <w:numPr>
+          <w:ilvl w:val="0"/>
+          <w:numId w:val="6"/>
+        </w:numPr>
+        <w:autoSpaceDE/>
+        <w:autoSpaceDN/>
+        <w:spacing w:after="160" w:line="278" w:lineRule="auto"/>
+        <w:rPr>
+          <w:lang w:val="es-MX"/>
+        </w:rPr>
+      </w:pPr>
+      <w:r>
+        <w:rPr>
+          <w:lang w:val="es-MX"/>
+        </w:rPr>
+        <w:lastRenderedPageBreak/>
+        <w:t>Terminar de arreglar el dominio con clases que son la base para la ejecución del juego.</w:t>
+      </w:r>
+    </w:p>
+    <w:p>
+      <w:pPr>
+        <w:pStyle w:val="Prrafodelista"/>
+        <w:widowControl/>
+        <w:numPr>
+          <w:ilvl w:val="0"/>
+          <w:numId w:val="6"/>
+        </w:numPr>
+        <w:autoSpaceDE/>
+        <w:autoSpaceDN/>
+        <w:spacing w:after="160" w:line="278" w:lineRule="auto"/>
+        <w:rPr>
+          <w:lang w:val="es-MX"/>
+        </w:rPr>
+      </w:pPr>
+      <w:r>
+        <w:rPr>
+          <w:lang w:val="es-MX"/>
+        </w:rPr>
+        <w:t>Implementar los nuevos tipos de enemigos y los tipos de moneda</w:t>
+      </w:r>
+    </w:p>
+    <w:p>
+      <w:pPr>
+        <w:pStyle w:val="Prrafodelista"/>
+        <w:widowControl/>
+        <w:numPr>
+          <w:ilvl w:val="0"/>
+          <w:numId w:val="6"/>
+        </w:numPr>
+        <w:autoSpaceDE/>
+        <w:autoSpaceDN/>
+        <w:spacing w:after="160" w:line="278" w:lineRule="auto"/>
+        <w:rPr>
+          <w:lang w:val="es-MX"/>
+        </w:rPr>
+      </w:pPr>
+      <w:r>
+        <w:rPr>
+          <w:lang w:val="es-MX"/>
+        </w:rPr>
+        <w:t>Añadir los elementos especiales de Bomba y Fuente de vida que se piden</w:t>
+      </w:r>
+    </w:p>
+    <w:p>
+      <w:pPr>
+        <w:pStyle w:val="Prrafodelista"/>
+        <w:widowControl/>
+        <w:numPr>
+          <w:ilvl w:val="0"/>
+          <w:numId w:val="6"/>
+        </w:numPr>
+        <w:autoSpaceDE/>
+        <w:autoSpaceDN/>
+        <w:spacing w:after="160" w:line="278" w:lineRule="auto"/>
+        <w:rPr>
+          <w:lang w:val="es-MX"/>
+        </w:rPr>
+      </w:pPr>
+      <w:r>
+        <w:rPr>
+          <w:lang w:val="es-MX"/>
+        </w:rPr>
+        <w:t>Mejorar la parte de la presentación con nuevas pantallas para guiar a la persona en su recorrido y elección de personaje</w:t>
+      </w:r>
+    </w:p>
+    <w:p>
+      <w:pPr>
+        <w:pStyle w:val="Prrafodelista"/>
+        <w:widowControl/>
+        <w:numPr>
+          <w:ilvl w:val="0"/>
+          <w:numId w:val="6"/>
+        </w:numPr>
+        <w:autoSpaceDE/>
+        <w:autoSpaceDN/>
+        <w:spacing w:after="160" w:line="278" w:lineRule="auto"/>
+        <w:rPr>
+          <w:lang w:val="es-MX"/>
+        </w:rPr>
+      </w:pPr>
+      <w:r>
+        <w:rPr>
+          <w:lang w:val="es-MX"/>
+        </w:rPr>
+        <w:t>Implementar el tablero que se pueda jugar</w:t>
+      </w:r>
+    </w:p>
+    <w:p>
+      <w:pPr>
+        <w:pStyle w:val="Prrafodelista"/>
+        <w:widowControl/>
+        <w:numPr>
+          <w:ilvl w:val="0"/>
+          <w:numId w:val="6"/>
+        </w:numPr>
+        <w:autoSpaceDE/>
+        <w:autoSpaceDN/>
+        <w:spacing w:after="160" w:line="278" w:lineRule="auto"/>
+        <w:rPr>
+          <w:lang w:val="es-MX"/>
+        </w:rPr>
+      </w:pPr>
+      <w:r>
+        <w:rPr>
+          <w:lang w:val="es-MX"/>
+        </w:rPr>
+        <w:t>Realizar el empalme entre Presentación y Dominio con la clase de Nivel</w:t>
+      </w:r>
+    </w:p>
+    <w:p>
+      <w:pPr>
+        <w:pStyle w:val="Prrafodelista"/>
+        <w:widowControl/>
+        <w:numPr>
+          <w:ilvl w:val="0"/>
+          <w:numId w:val="6"/>
+        </w:numPr>
+        <w:autoSpaceDE/>
+        <w:autoSpaceDN/>
+        <w:spacing w:after="160" w:line="278" w:lineRule="auto"/>
+        <w:rPr>
+          <w:lang w:val="es-MX"/>
+        </w:rPr>
+      </w:pPr>
+      <w:r>
+        <w:rPr>
+          <w:lang w:val="es-MX"/>
+        </w:rPr>
+        <w:t xml:space="preserve">Implementar la clase </w:t>
+      </w:r>
+      <w:proofErr w:type="spellStart"/>
+      <w:r>
+        <w:rPr>
+          <w:lang w:val="es-MX"/>
+        </w:rPr>
+        <w:t>LevelLoader</w:t>
+      </w:r>
+      <w:proofErr w:type="spellEnd"/>
+      <w:r>
+        <w:rPr>
+          <w:lang w:val="es-MX"/>
+        </w:rPr>
+        <w:t xml:space="preserve"> para poder cargar el nivel en el GUI y mostrarlo, además de que sirve para guardar más niveles y exportarlos al juego desde la carpeta de recursos teniéndolos como archivos .</w:t>
+      </w:r>
+      <w:proofErr w:type="spellStart"/>
+      <w:r>
+        <w:rPr>
+          <w:lang w:val="es-MX"/>
+        </w:rPr>
+        <w:t>txt</w:t>
+      </w:r>
+      <w:proofErr w:type="spellEnd"/>
+    </w:p>
+    <w:p>
+      <w:pPr>
+        <w:pStyle w:val="Prrafodelista"/>
+        <w:widowControl/>
+        <w:numPr>
+          <w:ilvl w:val="0"/>
+          <w:numId w:val="6"/>
+        </w:numPr>
+        <w:autoSpaceDE/>
+        <w:autoSpaceDN/>
+        <w:spacing w:after="160" w:line="278" w:lineRule="auto"/>
+        <w:rPr>
+          <w:lang w:val="es-MX"/>
+        </w:rPr>
+      </w:pPr>
+      <w:r>
+        <w:rPr>
+          <w:lang w:val="es-MX"/>
+        </w:rPr>
+        <w:t xml:space="preserve">Implementación de los métodos de </w:t>
+      </w:r>
+      <w:proofErr w:type="spellStart"/>
+      <w:r>
+        <w:rPr>
+          <w:lang w:val="es-MX"/>
+        </w:rPr>
+        <w:t>saveGame</w:t>
+      </w:r>
+      <w:proofErr w:type="spellEnd"/>
+      <w:r>
+        <w:rPr>
+          <w:lang w:val="es-MX"/>
+        </w:rPr>
+        <w:t xml:space="preserve"> y </w:t>
+      </w:r>
+      <w:proofErr w:type="spellStart"/>
+      <w:r>
+        <w:rPr>
+          <w:lang w:val="es-MX"/>
+        </w:rPr>
+        <w:t>loadGame</w:t>
+      </w:r>
+      <w:proofErr w:type="spellEnd"/>
+      <w:r>
+        <w:rPr>
+          <w:lang w:val="es-MX"/>
+        </w:rPr>
+        <w:t xml:space="preserve"> para cumplir con el requisito de Persistencia</w:t>
+      </w:r>
+    </w:p>
+    <w:p>
+      <w:pPr>
+        <w:pStyle w:val="Prrafodelista"/>
+        <w:widowControl/>
+        <w:numPr>
+          <w:ilvl w:val="0"/>
+          <w:numId w:val="6"/>
+        </w:numPr>
+        <w:autoSpaceDE/>
+        <w:autoSpaceDN/>
+        <w:spacing w:after="160" w:line="278" w:lineRule="auto"/>
+        <w:rPr>
+          <w:lang w:val="es-MX"/>
+        </w:rPr>
+      </w:pPr>
+      <w:r>
+        <w:rPr>
+          <w:lang w:val="es-MX"/>
+        </w:rPr>
+        <w:t xml:space="preserve">Implementar las diferentes configuraciones como lo son la de </w:t>
+      </w:r>
+      <w:proofErr w:type="spellStart"/>
+      <w:r>
+        <w:rPr>
+          <w:lang w:val="es-MX"/>
+        </w:rPr>
+        <w:t>PlayerVSMachine</w:t>
+      </w:r>
+      <w:proofErr w:type="spellEnd"/>
+      <w:r>
+        <w:rPr>
+          <w:lang w:val="es-MX"/>
+        </w:rPr>
+        <w:t xml:space="preserve"> &amp; </w:t>
+      </w:r>
+      <w:proofErr w:type="spellStart"/>
+      <w:r>
+        <w:rPr>
+          <w:lang w:val="es-MX"/>
+        </w:rPr>
+        <w:t>PlayerVSPlayer</w:t>
+      </w:r>
+      <w:proofErr w:type="spellEnd"/>
+    </w:p>
+    <w:p>
+      <w:pPr>
+        <w:pStyle w:val="Prrafodelista"/>
+        <w:widowControl/>
+        <w:numPr>
+          <w:ilvl w:val="0"/>
+          <w:numId w:val="6"/>
+        </w:numPr>
+        <w:autoSpaceDE/>
+        <w:autoSpaceDN/>
+        <w:spacing w:after="160" w:line="278" w:lineRule="auto"/>
+        <w:rPr>
+          <w:lang w:val="es-MX"/>
+        </w:rPr>
+      </w:pPr>
+      <w:r>
+        <w:rPr>
+          <w:lang w:val="es-MX"/>
+        </w:rPr>
+        <w:t>Implementación de la clase Test para las pruebas de Unidad con los métodos que hay en dominio</w:t>
+      </w:r>
+    </w:p>
+    <w:p>
+      <w:pPr>
+        <w:pStyle w:val="Prrafodelista"/>
+        <w:widowControl/>
+        <w:numPr>
+          <w:ilvl w:val="0"/>
+          <w:numId w:val="6"/>
+        </w:numPr>
+        <w:autoSpaceDE/>
+        <w:autoSpaceDN/>
+        <w:spacing w:after="160" w:line="278" w:lineRule="auto"/>
+        <w:rPr>
+          <w:lang w:val="es-MX"/>
+        </w:rPr>
+      </w:pPr>
+      <w:r>
+        <w:rPr>
+          <w:lang w:val="es-MX"/>
+        </w:rPr>
+        <w:t>Realización de los diagramas de secuencia del código de Dominio</w:t>
+      </w:r>
+    </w:p>
+    <w:p>
+      <w:pPr>
+        <w:pStyle w:val="Prrafodelista"/>
+        <w:widowControl/>
+        <w:numPr>
+          <w:ilvl w:val="0"/>
+          <w:numId w:val="6"/>
+        </w:numPr>
+        <w:autoSpaceDE/>
+        <w:autoSpaceDN/>
+        <w:spacing w:after="160" w:line="278" w:lineRule="auto"/>
+        <w:rPr>
+          <w:lang w:val="es-MX"/>
+        </w:rPr>
+      </w:pPr>
+      <w:r>
+        <w:rPr>
+          <w:lang w:val="es-MX"/>
+        </w:rPr>
+        <w:t>Realizar una actualización del diagrama de Clases del paquete de presentación para que este de acorde como en el código.</w:t>
+      </w:r>
+    </w:p>
+    <w:p>
+      <w:pPr>
+        <w:pStyle w:val="Prrafodelista"/>
+        <w:widowControl/>
+        <w:autoSpaceDE/>
+        <w:autoSpaceDN/>
+        <w:spacing w:after="160" w:line="278" w:lineRule="auto"/>
+        <w:ind w:left="1440"/>
+        <w:rPr>
+          <w:lang w:val="es-MX"/>
+        </w:rPr>
+      </w:pPr>
+      <w:r>
+        <w:rPr>
+          <w:lang w:val="es-MX"/>
+        </w:rPr>
+        <w:br/>
+      </w:r>
+    </w:p>
+    <w:p>
+      <w:pPr>
+        <w:pStyle w:val="Prrafodelista"/>
+        <w:widowControl/>
+        <w:numPr>
+          <w:ilvl w:val="0"/>
+          <w:numId w:val="5"/>
+        </w:numPr>
+        <w:autoSpaceDE/>
+        <w:autoSpaceDN/>
+        <w:spacing w:after="160" w:line="278" w:lineRule="auto"/>
+        <w:rPr>
+          <w:lang w:val="es-MX"/>
+        </w:rPr>
+      </w:pPr>
+      <w:r>
+        <w:rPr>
+          <w:b/>
+          <w:bCs/>
+          <w:lang w:val="es-MX"/>
+        </w:rPr>
+        <w:t xml:space="preserve">¿Cuál es el estado actual del proyecto en términos de </w:t>
+      </w:r>
+      <w:proofErr w:type="spellStart"/>
+      <w:r>
+        <w:rPr>
+          <w:b/>
+          <w:bCs/>
+          <w:lang w:val="es-MX"/>
+        </w:rPr>
+        <w:t>mini-ciclos</w:t>
+      </w:r>
+      <w:proofErr w:type="spellEnd"/>
+      <w:r>
+        <w:rPr>
+          <w:b/>
+          <w:bCs/>
+          <w:lang w:val="es-MX"/>
+        </w:rPr>
+        <w:t>? ¿por qué?</w:t>
+      </w:r>
+      <w:r>
+        <w:rPr>
+          <w:lang w:val="es-MX"/>
+        </w:rPr>
+        <w:br/>
+      </w:r>
+      <w:r>
+        <w:rPr>
+          <w:lang w:val="es-MX"/>
+        </w:rPr>
+        <w:t xml:space="preserve">Realizado al 90%. Falta la implementación del código de Pruebas Unitarias, código el cual tengo aún dudas si se tiene que realizar para todos los métodos de la clase </w:t>
+      </w:r>
+      <w:r>
+        <w:rPr>
+          <w:lang w:val="es-MX"/>
+        </w:rPr>
+        <w:t>Game (</w:t>
+      </w:r>
+      <w:r>
+        <w:rPr>
+          <w:lang w:val="es-MX"/>
+        </w:rPr>
+        <w:t>Clase controladora en Dominio) y también su diseño de diagramas de secuencia</w:t>
+      </w:r>
+      <w:r>
+        <w:rPr>
+          <w:lang w:val="es-MX"/>
+        </w:rPr>
+        <w:br/>
+      </w:r>
+    </w:p>
+    <w:p>
+      <w:pPr>
+        <w:pStyle w:val="Prrafodelista"/>
+        <w:widowControl/>
+        <w:numPr>
+          <w:ilvl w:val="0"/>
+          <w:numId w:val="5"/>
+        </w:numPr>
+        <w:autoSpaceDE/>
+        <w:autoSpaceDN/>
+        <w:spacing w:after="160" w:line="278" w:lineRule="auto"/>
+        <w:rPr>
+          <w:lang w:val="es-MX"/>
+        </w:rPr>
+      </w:pPr>
+      <w:r>
+        <w:rPr>
+          <w:b/>
+          <w:bCs/>
+          <w:lang w:val="es-MX"/>
+        </w:rPr>
+        <w:t>¿Cuál fue el tiempo total invertido por cada uno de ustedes? Horas/hombre)</w:t>
+      </w:r>
+      <w:r>
+        <w:rPr>
+          <w:lang w:val="es-MX"/>
+        </w:rPr>
+        <w:br/>
+        <w:t xml:space="preserve">Tiempo invertido por Carlos Rojas: </w:t>
+      </w:r>
+      <w:r>
+        <w:rPr>
+          <w:lang w:val="es-MX"/>
+        </w:rPr>
+        <w:t>Para este ciclo #2 el tiempo invertido fue de 32 horas adicionales.</w:t>
+      </w:r>
+    </w:p>
+    <w:p>
+      <w:pPr>
+        <w:pStyle w:val="Prrafodelista"/>
+        <w:rPr>
+          <w:b/>
+          <w:bCs/>
+          <w:lang w:val="es-MX"/>
+        </w:rPr>
+      </w:pPr>
+      <w:r>
+        <w:rPr>
+          <w:lang w:val="es-MX"/>
+        </w:rPr>
+        <w:br/>
+      </w:r>
+    </w:p>
+    <w:p>
+      <w:pPr>
+        <w:pStyle w:val="Prrafodelista"/>
+        <w:widowControl/>
+        <w:numPr>
+          <w:ilvl w:val="0"/>
+          <w:numId w:val="5"/>
+        </w:numPr>
+        <w:autoSpaceDE/>
+        <w:autoSpaceDN/>
+        <w:spacing w:after="160" w:line="278" w:lineRule="auto"/>
+        <w:rPr>
+          <w:lang w:val="es-MX"/>
+        </w:rPr>
+      </w:pPr>
+      <w:r>
+        <w:rPr>
+          <w:b/>
+          <w:bCs/>
+          <w:lang w:val="es-MX"/>
+        </w:rPr>
+        <w:t>¿Cuál consideran que fue el mayor logro? ¿por qué?</w:t>
+      </w:r>
+      <w:r>
+        <w:rPr>
+          <w:lang w:val="es-MX"/>
+        </w:rPr>
+        <w:br/>
+        <w:t xml:space="preserve">El mayor logro </w:t>
+      </w:r>
+      <w:r>
+        <w:rPr>
+          <w:lang w:val="es-MX"/>
+        </w:rPr>
+        <w:t>considero que fue el diseño de la capa de presentación y que quede llamativa. Es un logro importante para mi porque tengo varias deficiencias en el diseño de pantallas, y fue un gran reto realizar estas pantallas y botones para tener después una apariencia llamativa.</w:t>
+      </w:r>
+    </w:p>
+    <w:p>
+      <w:pPr>
+        <w:pStyle w:val="Prrafodelista"/>
+        <w:rPr>
+          <w:lang w:val="es-MX"/>
+        </w:rPr>
+      </w:pPr>
+    </w:p>
+    <w:p>
+      <w:pPr>
+        <w:pStyle w:val="Prrafodelista"/>
+        <w:widowControl/>
+        <w:numPr>
+          <w:ilvl w:val="0"/>
+          <w:numId w:val="5"/>
+        </w:numPr>
+        <w:autoSpaceDE/>
+        <w:autoSpaceDN/>
+        <w:spacing w:after="160" w:line="278" w:lineRule="auto"/>
+        <w:rPr>
+          <w:b/>
+          <w:bCs/>
+          <w:lang w:val="es-MX"/>
+        </w:rPr>
+      </w:pPr>
+      <w:r>
+        <w:rPr>
+          <w:b/>
+          <w:bCs/>
+          <w:lang w:val="es-MX"/>
+        </w:rPr>
+        <w:t>¿Cuál consideran que fue el mayor problema técnico? ¿Qué hicieron para resolverlo?</w:t>
+      </w:r>
+      <w:r>
+        <w:rPr>
+          <w:lang w:val="es-MX"/>
+        </w:rPr>
+        <w:br/>
+        <w:t>El</w:t>
+      </w:r>
+      <w:r>
+        <w:rPr>
+          <w:lang w:val="es-MX"/>
+        </w:rPr>
+        <w:t xml:space="preserve"> mayor problema técnico fue sin dudas usar el </w:t>
+      </w:r>
+      <w:r>
+        <w:rPr>
+          <w:lang w:val="es-MX"/>
+        </w:rPr>
+        <w:t xml:space="preserve">componente de </w:t>
+      </w:r>
+      <w:proofErr w:type="spellStart"/>
+      <w:r>
+        <w:rPr>
+          <w:lang w:val="es-MX"/>
+        </w:rPr>
+        <w:t>Graphics</w:t>
+      </w:r>
+      <w:proofErr w:type="spellEnd"/>
+      <w:r>
+        <w:rPr>
+          <w:lang w:val="es-MX"/>
+        </w:rPr>
+        <w:t xml:space="preserve"> para realizar el dibujo de las pantallas y su diseño. Me apoyé de la IA para realizar todo este diseño y aprender del mismo.</w:t>
+      </w:r>
+      <w:r>
+        <w:rPr>
+          <w:lang w:val="es-MX"/>
+        </w:rPr>
+        <w:br/>
+      </w:r>
+    </w:p>
+    <w:p>
+      <w:pPr>
+        <w:rPr>
+          <w:lang w:val="es-MX"/>
+        </w:rPr>
+      </w:pPr>
+      <w:r>
+        <w:rPr>
+          <w:b/>
+          <w:bCs/>
+          <w:lang w:val="es-MX"/>
+        </w:rPr>
+        <w:t>¿Qué hicieron bien como equipo? ¿Qué se comprometen a hacer para mejorar los resultados?</w:t>
+      </w:r>
+      <w:r>
+        <w:rPr>
+          <w:lang w:val="es-MX"/>
+        </w:rPr>
+        <w:br/>
+      </w:r>
+      <w:r>
+        <w:rPr>
+          <w:lang w:val="es-MX"/>
+        </w:rPr>
+        <w:t xml:space="preserve">A pesar de estar atrasado en el proyecto, fue la dedicación y revisión de necesidades del proyecto para lograr lo propuesto para esta entrega adicional de lo que faltaba para la anterior entrega. </w:t>
+      </w:r>
+      <w:r>
+        <w:rPr>
+          <w:lang w:val="es-MX"/>
+        </w:rPr>
+        <w:lastRenderedPageBreak/>
+        <w:t xml:space="preserve">También tener el buen uso de la IA como método de estudio para complementar conocimientos y una buena planeación de cosas que hacían falta. </w:t>
+      </w:r>
+      <w:r>
+        <w:rPr>
+          <w:lang w:val="es-MX"/>
+        </w:rPr>
+        <w:br/>
+        <w:t>Me comprometo a tener una mejor planeación para los ciclos faltantes y tener una mejor organización de tiempo para cumplir con lo establecido.</w:t>
+      </w:r>
+    </w:p>
+    <w:p>
+      <w:pPr>
+        <w:rPr>
+          <w:lang w:val="es-MX"/>
+        </w:rPr>
+      </w:pPr>
+    </w:p>
+    <w:p>
+      <w:pPr>
+        <w:rPr>
+          <w:lang w:val="es-MX"/>
+        </w:rPr>
+      </w:pPr>
+    </w:p>
+    <w:p>
+      <w:pPr>
+        <w:rPr>
+          <w:b/>
+          <w:bCs/>
+          <w:lang w:val="es-MX"/>
+        </w:rPr>
+      </w:pPr>
+      <w:r>
+        <w:rPr>
+          <w:b/>
+          <w:bCs/>
+          <w:lang w:val="es-MX"/>
+        </w:rPr>
+        <w:t>PLANIFICACIÓN PARA EL TERCER CICLO</w:t>
+      </w:r>
+    </w:p>
+    <w:p>
+      <w:pPr>
+        <w:pStyle w:val="Prrafodelista"/>
+        <w:numPr>
+          <w:ilvl w:val="0"/>
+          <w:numId w:val="7"/>
+        </w:numPr>
+        <w:rPr>
+          <w:b/>
+          <w:bCs/>
+          <w:lang w:val="es-MX"/>
+        </w:rPr>
+      </w:pPr>
+      <w:r>
+        <w:rPr>
+          <w:lang w:val="es-MX"/>
+        </w:rPr>
+        <w:t xml:space="preserve">Implementar el código necesario para tener una buena jugabilidad independiente del modo </w:t>
+      </w:r>
+    </w:p>
+    <w:p>
+      <w:pPr>
+        <w:pStyle w:val="Prrafodelista"/>
+        <w:numPr>
+          <w:ilvl w:val="0"/>
+          <w:numId w:val="7"/>
+        </w:numPr>
+        <w:rPr>
+          <w:b/>
+          <w:bCs/>
+          <w:lang w:val="es-MX"/>
+        </w:rPr>
+      </w:pPr>
+      <w:r>
+        <w:rPr>
+          <w:lang w:val="es-MX"/>
+        </w:rPr>
+        <w:t xml:space="preserve">Implementar el </w:t>
+      </w:r>
+      <w:r>
+        <w:rPr>
+          <w:lang w:val="es-MX"/>
+        </w:rPr>
+        <w:t>patrón</w:t>
+      </w:r>
+      <w:r>
+        <w:rPr>
+          <w:lang w:val="es-MX"/>
+        </w:rPr>
+        <w:t xml:space="preserve"> de movimiento que tendrán las máquinas para jugar dependiendo del modo que se elija y su “Personaje”</w:t>
+      </w:r>
+    </w:p>
+    <w:p>
+      <w:pPr>
+        <w:pStyle w:val="Prrafodelista"/>
+        <w:numPr>
+          <w:ilvl w:val="0"/>
+          <w:numId w:val="7"/>
+        </w:numPr>
+        <w:rPr>
+          <w:b/>
+          <w:bCs/>
+          <w:lang w:val="es-MX"/>
+        </w:rPr>
+      </w:pPr>
+      <w:r>
+        <w:rPr>
+          <w:lang w:val="es-MX"/>
+        </w:rPr>
+        <w:t xml:space="preserve">Hacer un estudio de casos que se puedan hacer y no hacer dentro del </w:t>
+      </w:r>
+      <w:proofErr w:type="spellStart"/>
+      <w:r>
+        <w:rPr>
+          <w:lang w:val="es-MX"/>
+        </w:rPr>
+        <w:t>jueg</w:t>
+      </w:r>
+      <w:proofErr w:type="spellEnd"/>
+    </w:p>
+    <w:p>
+      <w:pPr>
+        <w:pStyle w:val="Prrafodelista"/>
+        <w:numPr>
+          <w:ilvl w:val="0"/>
+          <w:numId w:val="7"/>
+        </w:numPr>
+        <w:rPr>
+          <w:b/>
+          <w:bCs/>
+          <w:lang w:val="es-MX"/>
+        </w:rPr>
+      </w:pPr>
+      <w:r>
+        <w:rPr>
+          <w:lang w:val="es-MX"/>
+        </w:rPr>
+        <w:t>Realizar la clase de pruebas de Aceptación del código según el estudio que se haya hecho.</w:t>
+      </w:r>
+    </w:p>
+    <w:p>
+      <w:pPr>
+        <w:pStyle w:val="Prrafodelista"/>
+        <w:numPr>
+          <w:ilvl w:val="0"/>
+          <w:numId w:val="7"/>
+        </w:numPr>
+        <w:rPr>
+          <w:b/>
+          <w:bCs/>
+          <w:lang w:val="es-MX"/>
+        </w:rPr>
+      </w:pPr>
+      <w:r>
+        <w:rPr>
+          <w:lang w:val="es-MX"/>
+        </w:rPr>
+        <w:t>Revisión de las pruebas de aceptación y documentar cada prueba de que hará y revisar una documentación</w:t>
+      </w:r>
+    </w:p>
+    <w:p>
+      <w:pPr>
+        <w:rPr>
+          <w:lang w:val="es-MX"/>
+        </w:rPr>
+      </w:pPr>
+      <w:r>
+        <w:rPr>
+          <w:b/>
+          <w:bCs/>
+          <w:lang w:val="es-MX"/>
+        </w:rPr>
+        <w:t>PLANIFICACIÓN PARA EL CUARTO CICLO</w:t>
+      </w:r>
+    </w:p>
+    <w:p>
+      <w:pPr>
+        <w:pStyle w:val="Prrafodelista"/>
+        <w:numPr>
+          <w:ilvl w:val="0"/>
+          <w:numId w:val="8"/>
+        </w:numPr>
+        <w:rPr>
+          <w:lang w:val="es-MX"/>
+        </w:rPr>
+      </w:pPr>
+      <w:r>
+        <w:rPr>
+          <w:lang w:val="es-MX"/>
+        </w:rPr>
+        <w:t>Revisión de todos lo pedido en cada ciclo y comparar con lo que se ha hecho en código</w:t>
+      </w:r>
+    </w:p>
+    <w:p>
+      <w:pPr>
+        <w:pStyle w:val="Prrafodelista"/>
+        <w:numPr>
+          <w:ilvl w:val="0"/>
+          <w:numId w:val="8"/>
+        </w:numPr>
+        <w:rPr>
+          <w:lang w:val="es-MX"/>
+        </w:rPr>
+      </w:pPr>
+      <w:r>
+        <w:rPr>
+          <w:lang w:val="es-MX"/>
+        </w:rPr>
+        <w:t>Revisión y actualización del Astah tanto en la parte de Dominio y Presentación</w:t>
+      </w:r>
+    </w:p>
+    <w:p>
+      <w:pPr>
+        <w:pStyle w:val="Prrafodelista"/>
+        <w:numPr>
+          <w:ilvl w:val="0"/>
+          <w:numId w:val="8"/>
+        </w:numPr>
+        <w:rPr>
+          <w:lang w:val="es-MX"/>
+        </w:rPr>
+      </w:pPr>
+      <w:r>
+        <w:rPr>
+          <w:lang w:val="es-MX"/>
+        </w:rPr>
+        <w:t>Revisar posibles nuevas implementaciones en las pruebas de Aceptación y las pruebas de Unidad.</w:t>
+      </w:r>
+    </w:p>
+    <w:p>
+      <w:pPr>
+        <w:pStyle w:val="Prrafodelista"/>
+        <w:numPr>
+          <w:ilvl w:val="0"/>
+          <w:numId w:val="8"/>
+        </w:numPr>
+        <w:rPr>
+          <w:lang w:val="es-MX"/>
+        </w:rPr>
+      </w:pPr>
+      <w:r>
+        <w:rPr>
+          <w:lang w:val="es-MX"/>
+        </w:rPr>
+        <w:t>Analizar las posibles refactorizaciones de código que se puedan hacer y ver que tan viables son para realizarlas u omitirlas.</w:t>
+      </w:r>
     </w:p>
     <w:sectPr>
-      <w:headerReference w:type="default" r:id="rId5"/>
+      <w:headerReference w:type="default" r:id="rId7"/>
       <w:pgSz w:w="11900" w:h="16840"/>
       <w:pgMar w:top="1740" w:right="992" w:bottom="1400" w:left="992" w:header="0" w:footer="1205" w:gutter="0"/>
       <w:cols w:space="720"/>
     </w:sectPr>
   </w:body>
 </w:document>
+</file>
+
+<file path=word/endnotes.xml><?xml version="1.0" encoding="utf-8"?>
+<w:endnotes xmlns:wpc="http://schemas.microsoft.com/office/word/2010/wordprocessingCanvas" xmlns:cx="http://schemas.microsoft.com/office/drawing/2014/chartex" xmlns:cx1="http://schemas.microsoft.com/office/drawing/2015/9/8/chartex" xmlns:cx2="http://schemas.microsoft.com/office/drawing/2015/10/21/chartex" xmlns:cx3="http://schemas.microsoft.com/office/drawing/2016/5/9/chartex" xmlns:cx4="http://schemas.microsoft.com/office/drawing/2016/5/10/chartex" xmlns:cx5="http://schemas.microsoft.com/office/drawing/2016/5/11/chartex" xmlns:cx6="http://schemas.microsoft.com/office/drawing/2016/5/12/chartex" xmlns:cx7="http://schemas.microsoft.com/office/drawing/2016/5/13/chartex" xmlns:cx8="http://schemas.microsoft.com/office/drawing/2016/5/14/chartex" xmlns:mc="http://schemas.openxmlformats.org/markup-compatibility/2006" xmlns:aink="http://schemas.microsoft.com/office/drawing/2016/ink" xmlns:am3d="http://schemas.microsoft.com/office/drawing/2017/model3d" xmlns:o="urn:schemas-microsoft-com:office:office" xmlns:oel="http://schemas.microsoft.com/office/2019/extlst" xmlns:r="http://schemas.openxmlformats.org/officeDocument/2006/relationships" xmlns:m="http://schemas.openxmlformats.org/officeDocument/2006/math" xmlns:v="urn:schemas-microsoft-com:vml" xmlns:wp14="http://schemas.microsoft.com/office/word/2010/wordprocessingDrawing" xmlns:wp="http://schemas.openxmlformats.org/drawingml/2006/wordprocessingDrawing" xmlns:w10="urn:schemas-microsoft-com:office:word" xmlns:w="http://schemas.openxmlformats.org/wordprocessingml/2006/main" xmlns:w14="http://schemas.microsoft.com/office/word/2010/wordml" xmlns:w15="http://schemas.microsoft.com/office/word/2012/wordml" xmlns:w16cex="http://schemas.microsoft.com/office/word/2018/wordml/cex" xmlns:w16cid="http://schemas.microsoft.com/office/word/2016/wordml/cid" xmlns:w16="http://schemas.microsoft.com/office/word/2018/wordml" xmlns:w16sdtdh="http://schemas.microsoft.com/office/word/2020/wordml/sdtdatahash" xmlns:w16se="http://schemas.microsoft.com/office/word/2015/wordml/symex" xmlns:wpg="http://schemas.microsoft.com/office/word/2010/wordprocessingGroup" xmlns:wpi="http://schemas.microsoft.com/office/word/2010/wordprocessingInk" xmlns:wne="http://schemas.microsoft.com/office/word/2006/wordml" xmlns:wps="http://schemas.microsoft.com/office/word/2010/wordprocessingShape" mc:Ignorable="w14 w15 w16se w16cid w16 w16cex w16sdtdh wp14">
+  <w:endnote w:type="separator" w:id="-1">
+    <w:p>
+      <w:r>
+        <w:separator/>
+      </w:r>
+    </w:p>
+  </w:endnote>
+  <w:endnote w:type="continuationSeparator" w:id="0">
+    <w:p>
+      <w:r>
+        <w:continuationSeparator/>
+      </w:r>
+    </w:p>
+  </w:endnote>
+</w:endnotes>
+</file>
+
+<file path=word/footnotes.xml><?xml version="1.0" encoding="utf-8"?>
+<w:footnotes xmlns:wpc="http://schemas.microsoft.com/office/word/2010/wordprocessingCanvas" xmlns:cx="http://schemas.microsoft.com/office/drawing/2014/chartex" xmlns:cx1="http://schemas.microsoft.com/office/drawing/2015/9/8/chartex" xmlns:cx2="http://schemas.microsoft.com/office/drawing/2015/10/21/chartex" xmlns:cx3="http://schemas.microsoft.com/office/drawing/2016/5/9/chartex" xmlns:cx4="http://schemas.microsoft.com/office/drawing/2016/5/10/chartex" xmlns:cx5="http://schemas.microsoft.com/office/drawing/2016/5/11/chartex" xmlns:cx6="http://schemas.microsoft.com/office/drawing/2016/5/12/chartex" xmlns:cx7="http://schemas.microsoft.com/office/drawing/2016/5/13/chartex" xmlns:cx8="http://schemas.microsoft.com/office/drawing/2016/5/14/chartex" xmlns:mc="http://schemas.openxmlformats.org/markup-compatibility/2006" xmlns:aink="http://schemas.microsoft.com/office/drawing/2016/ink" xmlns:am3d="http://schemas.microsoft.com/office/drawing/2017/model3d" xmlns:o="urn:schemas-microsoft-com:office:office" xmlns:oel="http://schemas.microsoft.com/office/2019/extlst" xmlns:r="http://schemas.openxmlformats.org/officeDocument/2006/relationships" xmlns:m="http://schemas.openxmlformats.org/officeDocument/2006/math" xmlns:v="urn:schemas-microsoft-com:vml" xmlns:wp14="http://schemas.microsoft.com/office/word/2010/wordprocessingDrawing" xmlns:wp="http://schemas.openxmlformats.org/drawingml/2006/wordprocessingDrawing" xmlns:w10="urn:schemas-microsoft-com:office:word" xmlns:w="http://schemas.openxmlformats.org/wordprocessingml/2006/main" xmlns:w14="http://schemas.microsoft.com/office/word/2010/wordml" xmlns:w15="http://schemas.microsoft.com/office/word/2012/wordml" xmlns:w16cex="http://schemas.microsoft.com/office/word/2018/wordml/cex" xmlns:w16cid="http://schemas.microsoft.com/office/word/2016/wordml/cid" xmlns:w16="http://schemas.microsoft.com/office/word/2018/wordml" xmlns:w16sdtdh="http://schemas.microsoft.com/office/word/2020/wordml/sdtdatahash" xmlns:w16se="http://schemas.microsoft.com/office/word/2015/wordml/symex" xmlns:wpg="http://schemas.microsoft.com/office/word/2010/wordprocessingGroup" xmlns:wpi="http://schemas.microsoft.com/office/word/2010/wordprocessingInk" xmlns:wne="http://schemas.microsoft.com/office/word/2006/wordml" xmlns:wps="http://schemas.microsoft.com/office/word/2010/wordprocessingShape" mc:Ignorable="w14 w15 w16se w16cid w16 w16cex w16sdtdh wp14">
+  <w:footnote w:type="separator" w:id="-1">
+    <w:p>
+      <w:r>
+        <w:separator/>
+      </w:r>
+    </w:p>
+  </w:footnote>
+  <w:footnote w:type="continuationSeparator" w:id="0">
+    <w:p>
+      <w:r>
+        <w:continuationSeparator/>
+      </w:r>
+    </w:p>
+  </w:footnote>
+</w:footnotes>
 </file>
 
 <file path=word/header1.xml><?xml version="1.0" encoding="utf-8"?>
@@ -705,6 +1690,276 @@
 <file path=word/numbering.xml><?xml version="1.0" encoding="utf-8"?>
 <w:numbering xmlns:wpc="http://schemas.microsoft.com/office/word/2010/wordprocessingCanvas" xmlns:cx="http://schemas.microsoft.com/office/drawing/2014/chartex" xmlns:cx1="http://schemas.microsoft.com/office/drawing/2015/9/8/chartex" xmlns:cx2="http://schemas.microsoft.com/office/drawing/2015/10/21/chartex" xmlns:cx3="http://schemas.microsoft.com/office/drawing/2016/5/9/chartex" xmlns:cx4="http://schemas.microsoft.com/office/drawing/2016/5/10/chartex" xmlns:cx5="http://schemas.microsoft.com/office/drawing/2016/5/11/chartex" xmlns:cx6="http://schemas.microsoft.com/office/drawing/2016/5/12/chartex" xmlns:cx7="http://schemas.microsoft.com/office/drawing/2016/5/13/chartex" xmlns:cx8="http://schemas.microsoft.com/office/drawing/2016/5/14/chartex" xmlns:mc="http://schemas.openxmlformats.org/markup-compatibility/2006" xmlns:aink="http://schemas.microsoft.com/office/drawing/2016/ink" xmlns:am3d="http://schemas.microsoft.com/office/drawing/2017/model3d" xmlns:o="urn:schemas-microsoft-com:office:office" xmlns:oel="http://schemas.microsoft.com/office/2019/extlst" xmlns:r="http://schemas.openxmlformats.org/officeDocument/2006/relationships" xmlns:m="http://schemas.openxmlformats.org/officeDocument/2006/math" xmlns:v="urn:schemas-microsoft-com:vml" xmlns:wp14="http://schemas.microsoft.com/office/word/2010/wordprocessingDrawing" xmlns:wp="http://schemas.openxmlformats.org/drawingml/2006/wordprocessingDrawing" xmlns:w10="urn:schemas-microsoft-com:office:word" xmlns:w="http://schemas.openxmlformats.org/wordprocessingml/2006/main" xmlns:w14="http://schemas.microsoft.com/office/word/2010/wordml" xmlns:w15="http://schemas.microsoft.com/office/word/2012/wordml" xmlns:w16cex="http://schemas.microsoft.com/office/word/2018/wordml/cex" xmlns:w16cid="http://schemas.microsoft.com/office/word/2016/wordml/cid" xmlns:w16="http://schemas.microsoft.com/office/word/2018/wordml" xmlns:w16sdtdh="http://schemas.microsoft.com/office/word/2020/wordml/sdtdatahash" xmlns:w16se="http://schemas.microsoft.com/office/word/2015/wordml/symex" xmlns:wpg="http://schemas.microsoft.com/office/word/2010/wordprocessingGroup" xmlns:wpi="http://schemas.microsoft.com/office/word/2010/wordprocessingInk" xmlns:wne="http://schemas.microsoft.com/office/word/2006/wordml" xmlns:wps="http://schemas.microsoft.com/office/word/2010/wordprocessingShape" mc:Ignorable="w14 w15 w16se w16cid w16 w16cex w16sdtdh wp14">
   <w:abstractNum w:abstractNumId="0" w15:restartNumberingAfterBreak="0">
+    <w:nsid w:val="050E11DC"/>
+    <w:multiLevelType w:val="hybridMultilevel"/>
+    <w:tmpl w:val="BF5835DE"/>
+    <w:lvl w:ilvl="0" w:tplc="9F1C7C80">
+      <w:start w:val="1"/>
+      <w:numFmt w:val="decimal"/>
+      <w:lvlText w:val="%1."/>
+      <w:lvlJc w:val="left"/>
+      <w:pPr>
+        <w:ind w:left="1440" w:hanging="360"/>
+      </w:pPr>
+      <w:rPr>
+        <w:rFonts w:hint="default"/>
+      </w:rPr>
+    </w:lvl>
+    <w:lvl w:ilvl="1" w:tplc="240A0019" w:tentative="1">
+      <w:start w:val="1"/>
+      <w:numFmt w:val="lowerLetter"/>
+      <w:lvlText w:val="%2."/>
+      <w:lvlJc w:val="left"/>
+      <w:pPr>
+        <w:ind w:left="2160" w:hanging="360"/>
+      </w:pPr>
+    </w:lvl>
+    <w:lvl w:ilvl="2" w:tplc="240A001B" w:tentative="1">
+      <w:start w:val="1"/>
+      <w:numFmt w:val="lowerRoman"/>
+      <w:lvlText w:val="%3."/>
+      <w:lvlJc w:val="right"/>
+      <w:pPr>
+        <w:ind w:left="2880" w:hanging="180"/>
+      </w:pPr>
+    </w:lvl>
+    <w:lvl w:ilvl="3" w:tplc="240A000F" w:tentative="1">
+      <w:start w:val="1"/>
+      <w:numFmt w:val="decimal"/>
+      <w:lvlText w:val="%4."/>
+      <w:lvlJc w:val="left"/>
+      <w:pPr>
+        <w:ind w:left="3600" w:hanging="360"/>
+      </w:pPr>
+    </w:lvl>
+    <w:lvl w:ilvl="4" w:tplc="240A0019" w:tentative="1">
+      <w:start w:val="1"/>
+      <w:numFmt w:val="lowerLetter"/>
+      <w:lvlText w:val="%5."/>
+      <w:lvlJc w:val="left"/>
+      <w:pPr>
+        <w:ind w:left="4320" w:hanging="360"/>
+      </w:pPr>
+    </w:lvl>
+    <w:lvl w:ilvl="5" w:tplc="240A001B" w:tentative="1">
+      <w:start w:val="1"/>
+      <w:numFmt w:val="lowerRoman"/>
+      <w:lvlText w:val="%6."/>
+      <w:lvlJc w:val="right"/>
+      <w:pPr>
+        <w:ind w:left="5040" w:hanging="180"/>
+      </w:pPr>
+    </w:lvl>
+    <w:lvl w:ilvl="6" w:tplc="240A000F" w:tentative="1">
+      <w:start w:val="1"/>
+      <w:numFmt w:val="decimal"/>
+      <w:lvlText w:val="%7."/>
+      <w:lvlJc w:val="left"/>
+      <w:pPr>
+        <w:ind w:left="5760" w:hanging="360"/>
+      </w:pPr>
+    </w:lvl>
+    <w:lvl w:ilvl="7" w:tplc="240A0019" w:tentative="1">
+      <w:start w:val="1"/>
+      <w:numFmt w:val="lowerLetter"/>
+      <w:lvlText w:val="%8."/>
+      <w:lvlJc w:val="left"/>
+      <w:pPr>
+        <w:ind w:left="6480" w:hanging="360"/>
+      </w:pPr>
+    </w:lvl>
+    <w:lvl w:ilvl="8" w:tplc="240A001B" w:tentative="1">
+      <w:start w:val="1"/>
+      <w:numFmt w:val="lowerRoman"/>
+      <w:lvlText w:val="%9."/>
+      <w:lvlJc w:val="right"/>
+      <w:pPr>
+        <w:ind w:left="7200" w:hanging="180"/>
+      </w:pPr>
+    </w:lvl>
+  </w:abstractNum>
+  <w:abstractNum w:abstractNumId="1" w15:restartNumberingAfterBreak="0">
+    <w:nsid w:val="1C69275E"/>
+    <w:multiLevelType w:val="hybridMultilevel"/>
+    <w:tmpl w:val="BC883478"/>
+    <w:lvl w:ilvl="0" w:tplc="3B92C99A">
+      <w:start w:val="1"/>
+      <w:numFmt w:val="decimal"/>
+      <w:lvlText w:val="%1."/>
+      <w:lvlJc w:val="left"/>
+      <w:pPr>
+        <w:ind w:left="1080" w:hanging="360"/>
+      </w:pPr>
+      <w:rPr>
+        <w:rFonts w:hint="default"/>
+        <w:b/>
+      </w:rPr>
+    </w:lvl>
+    <w:lvl w:ilvl="1" w:tplc="240A0019" w:tentative="1">
+      <w:start w:val="1"/>
+      <w:numFmt w:val="lowerLetter"/>
+      <w:lvlText w:val="%2."/>
+      <w:lvlJc w:val="left"/>
+      <w:pPr>
+        <w:ind w:left="1800" w:hanging="360"/>
+      </w:pPr>
+    </w:lvl>
+    <w:lvl w:ilvl="2" w:tplc="240A001B" w:tentative="1">
+      <w:start w:val="1"/>
+      <w:numFmt w:val="lowerRoman"/>
+      <w:lvlText w:val="%3."/>
+      <w:lvlJc w:val="right"/>
+      <w:pPr>
+        <w:ind w:left="2520" w:hanging="180"/>
+      </w:pPr>
+    </w:lvl>
+    <w:lvl w:ilvl="3" w:tplc="240A000F" w:tentative="1">
+      <w:start w:val="1"/>
+      <w:numFmt w:val="decimal"/>
+      <w:lvlText w:val="%4."/>
+      <w:lvlJc w:val="left"/>
+      <w:pPr>
+        <w:ind w:left="3240" w:hanging="360"/>
+      </w:pPr>
+    </w:lvl>
+    <w:lvl w:ilvl="4" w:tplc="240A0019" w:tentative="1">
+      <w:start w:val="1"/>
+      <w:numFmt w:val="lowerLetter"/>
+      <w:lvlText w:val="%5."/>
+      <w:lvlJc w:val="left"/>
+      <w:pPr>
+        <w:ind w:left="3960" w:hanging="360"/>
+      </w:pPr>
+    </w:lvl>
+    <w:lvl w:ilvl="5" w:tplc="240A001B" w:tentative="1">
+      <w:start w:val="1"/>
+      <w:numFmt w:val="lowerRoman"/>
+      <w:lvlText w:val="%6."/>
+      <w:lvlJc w:val="right"/>
+      <w:pPr>
+        <w:ind w:left="4680" w:hanging="180"/>
+      </w:pPr>
+    </w:lvl>
+    <w:lvl w:ilvl="6" w:tplc="240A000F" w:tentative="1">
+      <w:start w:val="1"/>
+      <w:numFmt w:val="decimal"/>
+      <w:lvlText w:val="%7."/>
+      <w:lvlJc w:val="left"/>
+      <w:pPr>
+        <w:ind w:left="5400" w:hanging="360"/>
+      </w:pPr>
+    </w:lvl>
+    <w:lvl w:ilvl="7" w:tplc="240A0019" w:tentative="1">
+      <w:start w:val="1"/>
+      <w:numFmt w:val="lowerLetter"/>
+      <w:lvlText w:val="%8."/>
+      <w:lvlJc w:val="left"/>
+      <w:pPr>
+        <w:ind w:left="6120" w:hanging="360"/>
+      </w:pPr>
+    </w:lvl>
+    <w:lvl w:ilvl="8" w:tplc="240A001B" w:tentative="1">
+      <w:start w:val="1"/>
+      <w:numFmt w:val="lowerRoman"/>
+      <w:lvlText w:val="%9."/>
+      <w:lvlJc w:val="right"/>
+      <w:pPr>
+        <w:ind w:left="6840" w:hanging="180"/>
+      </w:pPr>
+    </w:lvl>
+  </w:abstractNum>
+  <w:abstractNum w:abstractNumId="2" w15:restartNumberingAfterBreak="0">
+    <w:nsid w:val="252D7524"/>
+    <w:multiLevelType w:val="hybridMultilevel"/>
+    <w:tmpl w:val="728A8236"/>
+    <w:lvl w:ilvl="0" w:tplc="D9B6B882">
+      <w:start w:val="1"/>
+      <w:numFmt w:val="decimal"/>
+      <w:lvlText w:val="%1."/>
+      <w:lvlJc w:val="left"/>
+      <w:pPr>
+        <w:ind w:left="720" w:hanging="360"/>
+      </w:pPr>
+      <w:rPr>
+        <w:rFonts w:hint="default"/>
+        <w:b/>
+        <w:bCs/>
+      </w:rPr>
+    </w:lvl>
+    <w:lvl w:ilvl="1" w:tplc="240A0019" w:tentative="1">
+      <w:start w:val="1"/>
+      <w:numFmt w:val="lowerLetter"/>
+      <w:lvlText w:val="%2."/>
+      <w:lvlJc w:val="left"/>
+      <w:pPr>
+        <w:ind w:left="1440" w:hanging="360"/>
+      </w:pPr>
+    </w:lvl>
+    <w:lvl w:ilvl="2" w:tplc="240A001B" w:tentative="1">
+      <w:start w:val="1"/>
+      <w:numFmt w:val="lowerRoman"/>
+      <w:lvlText w:val="%3."/>
+      <w:lvlJc w:val="right"/>
+      <w:pPr>
+        <w:ind w:left="2160" w:hanging="180"/>
+      </w:pPr>
+    </w:lvl>
+    <w:lvl w:ilvl="3" w:tplc="240A000F" w:tentative="1">
+      <w:start w:val="1"/>
+      <w:numFmt w:val="decimal"/>
+      <w:lvlText w:val="%4."/>
+      <w:lvlJc w:val="left"/>
+      <w:pPr>
+        <w:ind w:left="2880" w:hanging="360"/>
+      </w:pPr>
+    </w:lvl>
+    <w:lvl w:ilvl="4" w:tplc="240A0019" w:tentative="1">
+      <w:start w:val="1"/>
+      <w:numFmt w:val="lowerLetter"/>
+      <w:lvlText w:val="%5."/>
+      <w:lvlJc w:val="left"/>
+      <w:pPr>
+        <w:ind w:left="3600" w:hanging="360"/>
+      </w:pPr>
+    </w:lvl>
+    <w:lvl w:ilvl="5" w:tplc="240A001B" w:tentative="1">
+      <w:start w:val="1"/>
+      <w:numFmt w:val="lowerRoman"/>
+      <w:lvlText w:val="%6."/>
+      <w:lvlJc w:val="right"/>
+      <w:pPr>
+        <w:ind w:left="4320" w:hanging="180"/>
+      </w:pPr>
+    </w:lvl>
+    <w:lvl w:ilvl="6" w:tplc="240A000F" w:tentative="1">
+      <w:start w:val="1"/>
+      <w:numFmt w:val="decimal"/>
+      <w:lvlText w:val="%7."/>
+      <w:lvlJc w:val="left"/>
+      <w:pPr>
+        <w:ind w:left="5040" w:hanging="360"/>
+      </w:pPr>
+    </w:lvl>
+    <w:lvl w:ilvl="7" w:tplc="240A0019" w:tentative="1">
+      <w:start w:val="1"/>
+      <w:numFmt w:val="lowerLetter"/>
+      <w:lvlText w:val="%8."/>
+      <w:lvlJc w:val="left"/>
+      <w:pPr>
+        <w:ind w:left="5760" w:hanging="360"/>
+      </w:pPr>
+    </w:lvl>
+    <w:lvl w:ilvl="8" w:tplc="240A001B" w:tentative="1">
+      <w:start w:val="1"/>
+      <w:numFmt w:val="lowerRoman"/>
+      <w:lvlText w:val="%9."/>
+      <w:lvlJc w:val="right"/>
+      <w:pPr>
+        <w:ind w:left="6480" w:hanging="180"/>
+      </w:pPr>
+    </w:lvl>
+  </w:abstractNum>
+  <w:abstractNum w:abstractNumId="3" w15:restartNumberingAfterBreak="0">
     <w:nsid w:val="31DB666D"/>
     <w:multiLevelType w:val="hybridMultilevel"/>
     <w:tmpl w:val="7BC6E33E"/>
@@ -793,7 +2048,7 @@
       </w:pPr>
     </w:lvl>
   </w:abstractNum>
-  <w:abstractNum w:abstractNumId="1" w15:restartNumberingAfterBreak="0">
+  <w:abstractNum w:abstractNumId="4" w15:restartNumberingAfterBreak="0">
     <w:nsid w:val="490B5CD0"/>
     <w:multiLevelType w:val="hybridMultilevel"/>
     <w:tmpl w:val="4EBE3554"/>
@@ -879,7 +2134,96 @@
       </w:pPr>
     </w:lvl>
   </w:abstractNum>
-  <w:abstractNum w:abstractNumId="2" w15:restartNumberingAfterBreak="0">
+  <w:abstractNum w:abstractNumId="5" w15:restartNumberingAfterBreak="0">
+    <w:nsid w:val="55F604E5"/>
+    <w:multiLevelType w:val="hybridMultilevel"/>
+    <w:tmpl w:val="5658C4B8"/>
+    <w:lvl w:ilvl="0" w:tplc="240A000F">
+      <w:start w:val="1"/>
+      <w:numFmt w:val="decimal"/>
+      <w:lvlText w:val="%1."/>
+      <w:lvlJc w:val="left"/>
+      <w:pPr>
+        <w:ind w:left="720" w:hanging="360"/>
+      </w:pPr>
+      <w:rPr>
+        <w:rFonts w:hint="default"/>
+      </w:rPr>
+    </w:lvl>
+    <w:lvl w:ilvl="1" w:tplc="240A0019" w:tentative="1">
+      <w:start w:val="1"/>
+      <w:numFmt w:val="lowerLetter"/>
+      <w:lvlText w:val="%2."/>
+      <w:lvlJc w:val="left"/>
+      <w:pPr>
+        <w:ind w:left="1440" w:hanging="360"/>
+      </w:pPr>
+    </w:lvl>
+    <w:lvl w:ilvl="2" w:tplc="240A001B" w:tentative="1">
+      <w:start w:val="1"/>
+      <w:numFmt w:val="lowerRoman"/>
+      <w:lvlText w:val="%3."/>
+      <w:lvlJc w:val="right"/>
+      <w:pPr>
+        <w:ind w:left="2160" w:hanging="180"/>
+      </w:pPr>
+    </w:lvl>
+    <w:lvl w:ilvl="3" w:tplc="240A000F" w:tentative="1">
+      <w:start w:val="1"/>
+      <w:numFmt w:val="decimal"/>
+      <w:lvlText w:val="%4."/>
+      <w:lvlJc w:val="left"/>
+      <w:pPr>
+        <w:ind w:left="2880" w:hanging="360"/>
+      </w:pPr>
+    </w:lvl>
+    <w:lvl w:ilvl="4" w:tplc="240A0019" w:tentative="1">
+      <w:start w:val="1"/>
+      <w:numFmt w:val="lowerLetter"/>
+      <w:lvlText w:val="%5."/>
+      <w:lvlJc w:val="left"/>
+      <w:pPr>
+        <w:ind w:left="3600" w:hanging="360"/>
+      </w:pPr>
+    </w:lvl>
+    <w:lvl w:ilvl="5" w:tplc="240A001B" w:tentative="1">
+      <w:start w:val="1"/>
+      <w:numFmt w:val="lowerRoman"/>
+      <w:lvlText w:val="%6."/>
+      <w:lvlJc w:val="right"/>
+      <w:pPr>
+        <w:ind w:left="4320" w:hanging="180"/>
+      </w:pPr>
+    </w:lvl>
+    <w:lvl w:ilvl="6" w:tplc="240A000F" w:tentative="1">
+      <w:start w:val="1"/>
+      <w:numFmt w:val="decimal"/>
+      <w:lvlText w:val="%7."/>
+      <w:lvlJc w:val="left"/>
+      <w:pPr>
+        <w:ind w:left="5040" w:hanging="360"/>
+      </w:pPr>
+    </w:lvl>
+    <w:lvl w:ilvl="7" w:tplc="240A0019" w:tentative="1">
+      <w:start w:val="1"/>
+      <w:numFmt w:val="lowerLetter"/>
+      <w:lvlText w:val="%8."/>
+      <w:lvlJc w:val="left"/>
+      <w:pPr>
+        <w:ind w:left="5760" w:hanging="360"/>
+      </w:pPr>
+    </w:lvl>
+    <w:lvl w:ilvl="8" w:tplc="240A001B" w:tentative="1">
+      <w:start w:val="1"/>
+      <w:numFmt w:val="lowerRoman"/>
+      <w:lvlText w:val="%9."/>
+      <w:lvlJc w:val="right"/>
+      <w:pPr>
+        <w:ind w:left="6480" w:hanging="180"/>
+      </w:pPr>
+    </w:lvl>
+  </w:abstractNum>
+  <w:abstractNum w:abstractNumId="6" w15:restartNumberingAfterBreak="0">
     <w:nsid w:val="60613A1B"/>
     <w:multiLevelType w:val="hybridMultilevel"/>
     <w:tmpl w:val="FF24C310"/>
@@ -968,7 +2312,7 @@
       </w:pPr>
     </w:lvl>
   </w:abstractNum>
-  <w:abstractNum w:abstractNumId="3" w15:restartNumberingAfterBreak="0">
+  <w:abstractNum w:abstractNumId="7" w15:restartNumberingAfterBreak="0">
     <w:nsid w:val="67C5434A"/>
     <w:multiLevelType w:val="hybridMultilevel"/>
     <w:tmpl w:val="804C605E"/>
@@ -1058,13 +2402,13 @@
     </w:lvl>
   </w:abstractNum>
   <w:num w:numId="1" w16cid:durableId="2071419230">
-    <w:abstractNumId w:val="2"/>
+    <w:abstractNumId w:val="6"/>
   </w:num>
   <w:num w:numId="2" w16cid:durableId="1674333063">
-    <w:abstractNumId w:val="0"/>
+    <w:abstractNumId w:val="3"/>
   </w:num>
   <w:num w:numId="3" w16cid:durableId="849762012">
-    <w:abstractNumId w:val="1"/>
+    <w:abstractNumId w:val="4"/>
     <w:lvlOverride w:ilvl="0">
       <w:startOverride w:val="1"/>
     </w:lvlOverride>
@@ -1094,7 +2438,19 @@
     </w:lvlOverride>
   </w:num>
   <w:num w:numId="4" w16cid:durableId="1205873628">
-    <w:abstractNumId w:val="3"/>
+    <w:abstractNumId w:val="7"/>
+  </w:num>
+  <w:num w:numId="5" w16cid:durableId="264848375">
+    <w:abstractNumId w:val="1"/>
+  </w:num>
+  <w:num w:numId="6" w16cid:durableId="977029550">
+    <w:abstractNumId w:val="0"/>
+  </w:num>
+  <w:num w:numId="7" w16cid:durableId="1672097138">
+    <w:abstractNumId w:val="5"/>
+  </w:num>
+  <w:num w:numId="8" w16cid:durableId="1560289884">
+    <w:abstractNumId w:val="2"/>
   </w:num>
 </w:numbering>
 </file>

</xml_diff>

<commit_message>
Se realizaron todos los cambios necesarios para la entrega 4 del Proyecto antes del parcial, se documentaron todas las clases y métodos, se actualiza el Astah, se sube una última retrospectiva
</commit_message>
<xml_diff>
--- a/RETROSPECTIVA.docx
+++ b/RETROSPECTIVA.docx
@@ -639,14 +639,7 @@
           <w:sz w:val="56"/>
           <w:szCs w:val="56"/>
         </w:rPr>
-        <w:t xml:space="preserve">RETROSPECTIVA </w:t>
-      </w:r>
-      <w:r>
-        <w:rPr>
-          <w:sz w:val="56"/>
-          <w:szCs w:val="56"/>
-        </w:rPr>
-        <w:t>#2</w:t>
+        <w:t>RETROSPECTIVA #2</w:t>
       </w:r>
     </w:p>
     <w:p>
@@ -1111,11 +1104,6 @@
           <w:lang w:val="es-MX"/>
         </w:rPr>
         <w:br/>
-      </w:r>
-      <w:r>
-        <w:rPr>
-          <w:lang w:val="es-MX"/>
-        </w:rPr>
         <w:t xml:space="preserve">Realizado al 90%. Falta la implementación del código de Pruebas Unitarias, código el cual tengo aún dudas si se tiene que realizar para todos los métodos de la clase </w:t>
       </w:r>
       <w:r>
@@ -1218,13 +1206,7 @@
           <w:lang w:val="es-MX"/>
         </w:rPr>
         <w:br/>
-        <w:t xml:space="preserve">El mayor logro </w:t>
-      </w:r>
-      <w:r>
-        <w:rPr>
-          <w:lang w:val="es-MX"/>
-        </w:rPr>
-        <w:t>considero que fue el diseño de la capa de presentación y que quede llamativa. Es un logro importante para mi porque tengo varias deficiencias en el diseño de pantallas, y fue un gran reto realizar estas pantallas y botones para tener después una apariencia llamativa.</w:t>
+        <w:t>El mayor logro considero que fue el diseño de la capa de presentación y que quede llamativa. Es un logro importante para mi porque tengo varias deficiencias en el diseño de pantallas, y fue un gran reto realizar estas pantallas y botones para tener después una apariencia llamativa.</w:t>
       </w:r>
     </w:p>
     <w:p>
@@ -1265,13 +1247,7 @@
           <w:lang w:val="es-MX"/>
         </w:rPr>
         <w:br/>
-        <w:t>El</w:t>
-      </w:r>
-      <w:r>
-        <w:rPr>
-          <w:lang w:val="es-MX"/>
-        </w:rPr>
-        <w:t xml:space="preserve"> mayor problema técnico fue sin dudas usar el </w:t>
+        <w:t xml:space="preserve">El mayor problema técnico fue sin dudas usar el </w:t>
       </w:r>
       <w:r>
         <w:rPr>
@@ -1578,6 +1554,558 @@
         </w:rPr>
         <w:t>Analizar las posibles refactorizaciones de código que se puedan hacer y ver que tan viables son para realizarlas u omitirlas.</w:t>
       </w:r>
+    </w:p>
+    <w:p>
+      <w:pPr>
+        <w:rPr>
+          <w:lang w:val="es-MX"/>
+        </w:rPr>
+      </w:pPr>
+    </w:p>
+    <w:p>
+      <w:pPr>
+        <w:rPr>
+          <w:lang w:val="es-MX"/>
+        </w:rPr>
+      </w:pPr>
+    </w:p>
+    <w:p>
+      <w:pPr>
+        <w:ind w:left="720" w:hanging="360"/>
+        <w:jc w:val="center"/>
+        <w:rPr>
+          <w:sz w:val="56"/>
+          <w:szCs w:val="56"/>
+        </w:rPr>
+      </w:pPr>
+      <w:r>
+        <w:rPr>
+          <w:sz w:val="56"/>
+          <w:szCs w:val="56"/>
+        </w:rPr>
+        <w:t xml:space="preserve">ÚLTIMA </w:t>
+      </w:r>
+      <w:r>
+        <w:rPr>
+          <w:sz w:val="56"/>
+          <w:szCs w:val="56"/>
+        </w:rPr>
+        <w:t>RETROSPECTIVA</w:t>
+      </w:r>
+    </w:p>
+    <w:p>
+      <w:pPr>
+        <w:pStyle w:val="Prrafodelista"/>
+        <w:widowControl/>
+        <w:numPr>
+          <w:ilvl w:val="0"/>
+          <w:numId w:val="10"/>
+        </w:numPr>
+        <w:autoSpaceDE/>
+        <w:autoSpaceDN/>
+        <w:spacing w:after="160" w:line="278" w:lineRule="auto"/>
+        <w:rPr>
+          <w:lang w:val="es-MX"/>
+        </w:rPr>
+      </w:pPr>
+      <w:r>
+        <w:rPr>
+          <w:b/>
+          <w:bCs/>
+          <w:lang w:val="es-MX"/>
+        </w:rPr>
+        <w:t xml:space="preserve">¿Cuáles fueron los </w:t>
+      </w:r>
+      <w:proofErr w:type="spellStart"/>
+      <w:r>
+        <w:rPr>
+          <w:b/>
+          <w:bCs/>
+          <w:lang w:val="es-MX"/>
+        </w:rPr>
+        <w:t>mini-ciclos</w:t>
+      </w:r>
+      <w:proofErr w:type="spellEnd"/>
+      <w:r>
+        <w:rPr>
+          <w:b/>
+          <w:bCs/>
+          <w:lang w:val="es-MX"/>
+        </w:rPr>
+        <w:t xml:space="preserve"> definidos? </w:t>
+      </w:r>
+      <w:proofErr w:type="spellStart"/>
+      <w:r>
+        <w:rPr>
+          <w:b/>
+          <w:bCs/>
+          <w:lang w:val="es-MX"/>
+        </w:rPr>
+        <w:t>Justifiquelos</w:t>
+      </w:r>
+      <w:proofErr w:type="spellEnd"/>
+    </w:p>
+    <w:p>
+      <w:pPr>
+        <w:pStyle w:val="Prrafodelista"/>
+        <w:rPr>
+          <w:lang w:val="es-MX"/>
+        </w:rPr>
+      </w:pPr>
+      <w:r>
+        <w:rPr>
+          <w:lang w:val="es-MX"/>
+        </w:rPr>
+        <w:t>1. Revisar posibles cambios y documentación hecha</w:t>
+      </w:r>
+    </w:p>
+    <w:p>
+      <w:pPr>
+        <w:pStyle w:val="Prrafodelista"/>
+        <w:rPr>
+          <w:lang w:val="es-MX"/>
+        </w:rPr>
+      </w:pPr>
+      <w:r>
+        <w:rPr>
+          <w:lang w:val="es-MX"/>
+        </w:rPr>
+        <w:t>2. Actualizar el diagrama de Clases</w:t>
+      </w:r>
+    </w:p>
+    <w:p>
+      <w:pPr>
+        <w:pStyle w:val="Prrafodelista"/>
+        <w:rPr>
+          <w:lang w:val="es-MX"/>
+        </w:rPr>
+      </w:pPr>
+      <w:r>
+        <w:rPr>
+          <w:lang w:val="es-MX"/>
+        </w:rPr>
+        <w:t>3. Añadir más pruebas de unidad</w:t>
+      </w:r>
+    </w:p>
+    <w:p>
+      <w:pPr>
+        <w:pStyle w:val="Prrafodelista"/>
+        <w:rPr>
+          <w:lang w:val="es-MX"/>
+        </w:rPr>
+      </w:pPr>
+      <w:r>
+        <w:rPr>
+          <w:lang w:val="es-MX"/>
+        </w:rPr>
+        <w:t>4. Añadir pruebas necesarias de Aceptación</w:t>
+      </w:r>
+    </w:p>
+    <w:p>
+      <w:pPr>
+        <w:pStyle w:val="Prrafodelista"/>
+        <w:rPr>
+          <w:lang w:val="es-MX"/>
+        </w:rPr>
+      </w:pPr>
+      <w:r>
+        <w:rPr>
+          <w:lang w:val="es-MX"/>
+        </w:rPr>
+        <w:t>5. Revisar la parte gráfica y cambios necesarios</w:t>
+      </w:r>
+    </w:p>
+    <w:p>
+      <w:pPr>
+        <w:pStyle w:val="Prrafodelista"/>
+        <w:rPr>
+          <w:lang w:val="es-MX"/>
+        </w:rPr>
+      </w:pPr>
+      <w:r>
+        <w:rPr>
+          <w:lang w:val="es-MX"/>
+        </w:rPr>
+        <w:t>6. implementar los bordes del jugador</w:t>
+      </w:r>
+    </w:p>
+    <w:p>
+      <w:pPr>
+        <w:pStyle w:val="Prrafodelista"/>
+        <w:rPr>
+          <w:lang w:val="es-MX"/>
+        </w:rPr>
+      </w:pPr>
+      <w:r>
+        <w:rPr>
+          <w:lang w:val="es-MX"/>
+        </w:rPr>
+        <w:t>7. Implementar el color de los bordes y diferenciación.</w:t>
+      </w:r>
+    </w:p>
+    <w:p>
+      <w:pPr>
+        <w:pStyle w:val="Prrafodelista"/>
+        <w:rPr>
+          <w:lang w:val="es-MX"/>
+        </w:rPr>
+      </w:pPr>
+      <w:r>
+        <w:rPr>
+          <w:lang w:val="es-MX"/>
+        </w:rPr>
+        <w:t>8. Corrección de clase enlace entre Dominio y Presentación</w:t>
+      </w:r>
+    </w:p>
+    <w:p>
+      <w:pPr>
+        <w:pStyle w:val="Prrafodelista"/>
+        <w:rPr>
+          <w:b/>
+          <w:bCs/>
+          <w:lang w:val="es-MX"/>
+        </w:rPr>
+      </w:pPr>
+      <w:r>
+        <w:rPr>
+          <w:lang w:val="es-MX"/>
+        </w:rPr>
+        <w:br/>
+      </w:r>
+    </w:p>
+    <w:p>
+      <w:pPr>
+        <w:pStyle w:val="Prrafodelista"/>
+        <w:numPr>
+          <w:ilvl w:val="0"/>
+          <w:numId w:val="10"/>
+        </w:numPr>
+        <w:rPr>
+          <w:lang w:val="es-MX"/>
+        </w:rPr>
+      </w:pPr>
+      <w:r>
+        <w:rPr>
+          <w:b/>
+          <w:bCs/>
+          <w:lang w:val="es-MX"/>
+        </w:rPr>
+        <w:t xml:space="preserve">¿Cuál es el estado actual del proyecto en términos de </w:t>
+      </w:r>
+      <w:proofErr w:type="spellStart"/>
+      <w:r>
+        <w:rPr>
+          <w:b/>
+          <w:bCs/>
+          <w:lang w:val="es-MX"/>
+        </w:rPr>
+        <w:t>mini-ciclos</w:t>
+      </w:r>
+      <w:proofErr w:type="spellEnd"/>
+      <w:r>
+        <w:rPr>
+          <w:b/>
+          <w:bCs/>
+          <w:lang w:val="es-MX"/>
+        </w:rPr>
+        <w:t>? ¿por qué?</w:t>
+      </w:r>
+      <w:r>
+        <w:rPr>
+          <w:lang w:val="es-MX"/>
+        </w:rPr>
+        <w:br/>
+      </w:r>
+      <w:r>
+        <w:rPr>
+          <w:lang w:val="es-MX"/>
+        </w:rPr>
+        <w:t xml:space="preserve">Realizado a un +90%, dado que no se completaron todos los diagramas de secuencia por la refactorización constante que se estaba </w:t>
+      </w:r>
+      <w:proofErr w:type="spellStart"/>
+      <w:r>
+        <w:rPr>
+          <w:lang w:val="es-MX"/>
+        </w:rPr>
+        <w:t>haciend</w:t>
+      </w:r>
+      <w:proofErr w:type="spellEnd"/>
+      <w:r>
+        <w:rPr>
+          <w:lang w:val="es-MX"/>
+        </w:rPr>
+        <w:br/>
+      </w:r>
+    </w:p>
+    <w:p>
+      <w:pPr>
+        <w:pStyle w:val="Prrafodelista"/>
+        <w:widowControl/>
+        <w:numPr>
+          <w:ilvl w:val="0"/>
+          <w:numId w:val="10"/>
+        </w:numPr>
+        <w:autoSpaceDE/>
+        <w:autoSpaceDN/>
+        <w:spacing w:after="160" w:line="278" w:lineRule="auto"/>
+        <w:rPr>
+          <w:lang w:val="es-MX"/>
+        </w:rPr>
+      </w:pPr>
+      <w:r>
+        <w:rPr>
+          <w:b/>
+          <w:bCs/>
+          <w:lang w:val="es-MX"/>
+        </w:rPr>
+        <w:t>¿Cuál fue el tiempo total invertido por cada uno de ustedes? Horas/hombre)</w:t>
+      </w:r>
+      <w:r>
+        <w:rPr>
+          <w:lang w:val="es-MX"/>
+        </w:rPr>
+        <w:br/>
+        <w:t>Tiempo invertido por Carlos Rojas</w:t>
+      </w:r>
+      <w:r>
+        <w:rPr>
+          <w:lang w:val="es-MX"/>
+        </w:rPr>
+        <w:t xml:space="preserve"> en total del proyecto: 129 horas</w:t>
+      </w:r>
+    </w:p>
+    <w:p>
+      <w:pPr>
+        <w:pStyle w:val="Prrafodelista"/>
+        <w:rPr>
+          <w:b/>
+          <w:bCs/>
+          <w:lang w:val="es-MX"/>
+        </w:rPr>
+      </w:pPr>
+      <w:r>
+        <w:rPr>
+          <w:lang w:val="es-MX"/>
+        </w:rPr>
+        <w:br/>
+      </w:r>
+    </w:p>
+    <w:p>
+      <w:pPr>
+        <w:pStyle w:val="Prrafodelista"/>
+        <w:widowControl/>
+        <w:numPr>
+          <w:ilvl w:val="0"/>
+          <w:numId w:val="10"/>
+        </w:numPr>
+        <w:autoSpaceDE/>
+        <w:autoSpaceDN/>
+        <w:spacing w:after="160" w:line="278" w:lineRule="auto"/>
+        <w:rPr>
+          <w:lang w:val="es-MX"/>
+        </w:rPr>
+      </w:pPr>
+      <w:r>
+        <w:rPr>
+          <w:b/>
+          <w:bCs/>
+          <w:lang w:val="es-MX"/>
+        </w:rPr>
+        <w:t>¿Cuál consideran que fue el mayor logro? ¿por qué?</w:t>
+      </w:r>
+      <w:r>
+        <w:rPr>
+          <w:lang w:val="es-MX"/>
+        </w:rPr>
+        <w:br/>
+        <w:t xml:space="preserve">El mayor logro </w:t>
+      </w:r>
+      <w:r>
+        <w:rPr>
+          <w:lang w:val="es-MX"/>
+        </w:rPr>
+        <w:t>fue ver la implementación correcta del proyecto, que todo se moviera bien, no hubieras posibles Bugs. Es un orgullo haber realizado todo esto solo, pude demostrar mis conocimientos alrededor de lo aprendido en la materia, y ver todo el poder que uno tiene de crear, es grandioso.</w:t>
+      </w:r>
+    </w:p>
+    <w:p>
+      <w:pPr>
+        <w:pStyle w:val="Prrafodelista"/>
+        <w:rPr>
+          <w:lang w:val="es-MX"/>
+        </w:rPr>
+      </w:pPr>
+    </w:p>
+    <w:p>
+      <w:pPr>
+        <w:pStyle w:val="Prrafodelista"/>
+        <w:widowControl/>
+        <w:numPr>
+          <w:ilvl w:val="0"/>
+          <w:numId w:val="10"/>
+        </w:numPr>
+        <w:autoSpaceDE/>
+        <w:autoSpaceDN/>
+        <w:spacing w:after="160" w:line="278" w:lineRule="auto"/>
+        <w:rPr>
+          <w:b/>
+          <w:bCs/>
+          <w:lang w:val="es-MX"/>
+        </w:rPr>
+      </w:pPr>
+      <w:r>
+        <w:rPr>
+          <w:b/>
+          <w:bCs/>
+          <w:lang w:val="es-MX"/>
+        </w:rPr>
+        <w:t>¿Cuál consideran que fue el mayor problema técnico? ¿Qué hicieron para resolverlo?</w:t>
+      </w:r>
+      <w:r>
+        <w:rPr>
+          <w:lang w:val="es-MX"/>
+        </w:rPr>
+        <w:br/>
+        <w:t xml:space="preserve">El </w:t>
+      </w:r>
+      <w:r>
+        <w:rPr>
+          <w:lang w:val="es-MX"/>
+        </w:rPr>
+        <w:t xml:space="preserve">diseño del </w:t>
+      </w:r>
+      <w:proofErr w:type="spellStart"/>
+      <w:r>
+        <w:rPr>
+          <w:lang w:val="es-MX"/>
+        </w:rPr>
+        <w:t>PatrolMovement</w:t>
+      </w:r>
+      <w:proofErr w:type="spellEnd"/>
+      <w:r>
+        <w:rPr>
+          <w:lang w:val="es-MX"/>
+        </w:rPr>
+        <w:t xml:space="preserve">, no sabia como hacerlo, y me decidí por una manera cuadrada, </w:t>
+      </w:r>
+      <w:r>
+        <w:rPr>
+          <w:lang w:val="es-MX"/>
+        </w:rPr>
+        <w:lastRenderedPageBreak/>
+        <w:t xml:space="preserve">cumpliendo el requisito de que fuera una figura geométrica, me </w:t>
+      </w:r>
+      <w:proofErr w:type="gramStart"/>
+      <w:r>
+        <w:rPr>
+          <w:lang w:val="es-MX"/>
+        </w:rPr>
+        <w:t>base</w:t>
+      </w:r>
+      <w:proofErr w:type="gramEnd"/>
+      <w:r>
+        <w:rPr>
+          <w:lang w:val="es-MX"/>
+        </w:rPr>
+        <w:t xml:space="preserve"> en el movimiento de los enemigos del 3 nivel del juego original.</w:t>
+      </w:r>
+      <w:r>
+        <w:rPr>
+          <w:lang w:val="es-MX"/>
+        </w:rPr>
+        <w:br/>
+      </w:r>
+    </w:p>
+    <w:p>
+      <w:pPr>
+        <w:pStyle w:val="Prrafodelista"/>
+        <w:widowControl/>
+        <w:numPr>
+          <w:ilvl w:val="0"/>
+          <w:numId w:val="10"/>
+        </w:numPr>
+        <w:autoSpaceDE/>
+        <w:autoSpaceDN/>
+        <w:spacing w:after="160" w:line="278" w:lineRule="auto"/>
+        <w:rPr>
+          <w:lang w:val="es-MX"/>
+        </w:rPr>
+      </w:pPr>
+      <w:r>
+        <w:rPr>
+          <w:b/>
+          <w:bCs/>
+          <w:lang w:val="es-MX"/>
+        </w:rPr>
+        <w:t>¿Qué hicieron bien como equipo? ¿Qué se comprometen a hacer para mejorar los resultados?</w:t>
+      </w:r>
+      <w:r>
+        <w:rPr>
+          <w:lang w:val="es-MX"/>
+        </w:rPr>
+        <w:br/>
+        <w:t xml:space="preserve">El análisis </w:t>
+      </w:r>
+      <w:r>
+        <w:rPr>
+          <w:lang w:val="es-MX"/>
+        </w:rPr>
+        <w:t xml:space="preserve">de que faltaba, como lo podía implementar y que era lo que si o si </w:t>
+      </w:r>
+      <w:proofErr w:type="spellStart"/>
+      <w:r>
+        <w:rPr>
+          <w:lang w:val="es-MX"/>
+        </w:rPr>
+        <w:t>neceistaba</w:t>
+      </w:r>
+      <w:proofErr w:type="spellEnd"/>
+      <w:r>
+        <w:rPr>
+          <w:lang w:val="es-MX"/>
+        </w:rPr>
+        <w:t xml:space="preserve"> una refactorización urgente. Me comprometo a no </w:t>
+      </w:r>
+      <w:proofErr w:type="spellStart"/>
+      <w:r>
+        <w:rPr>
+          <w:lang w:val="es-MX"/>
+        </w:rPr>
+        <w:t>disvariar</w:t>
+      </w:r>
+      <w:proofErr w:type="spellEnd"/>
+      <w:r>
+        <w:rPr>
+          <w:lang w:val="es-MX"/>
+        </w:rPr>
+        <w:t xml:space="preserve"> tanto y quedarme bloqueado en una sola parte, que en este proyecto fue por la implementación del tablero, estoy casi que 100% seguro de </w:t>
+      </w:r>
+      <w:proofErr w:type="gramStart"/>
+      <w:r>
+        <w:rPr>
+          <w:lang w:val="es-MX"/>
+        </w:rPr>
+        <w:t>que</w:t>
+      </w:r>
+      <w:proofErr w:type="gramEnd"/>
+      <w:r>
+        <w:rPr>
+          <w:lang w:val="es-MX"/>
+        </w:rPr>
+        <w:t xml:space="preserve"> si hubiera tenido la capacidad en ese momento de arriesgarme, este proyecto hubiera podido avanzar de una manera más espectacular.</w:t>
+      </w:r>
+      <w:r>
+        <w:rPr>
+          <w:lang w:val="es-MX"/>
+        </w:rPr>
+        <w:br/>
+      </w:r>
+    </w:p>
+    <w:p>
+      <w:pPr>
+        <w:rPr>
+          <w:lang w:val="es-MX"/>
+        </w:rPr>
+      </w:pPr>
     </w:p>
     <w:sectPr>
       <w:headerReference w:type="default" r:id="rId7"/>
@@ -2401,6 +2929,186 @@
       </w:pPr>
     </w:lvl>
   </w:abstractNum>
+  <w:abstractNum w:abstractNumId="8" w15:restartNumberingAfterBreak="0">
+    <w:nsid w:val="795A3B50"/>
+    <w:multiLevelType w:val="hybridMultilevel"/>
+    <w:tmpl w:val="0718888A"/>
+    <w:lvl w:ilvl="0" w:tplc="24E49ACC">
+      <w:start w:val="1"/>
+      <w:numFmt w:val="decimal"/>
+      <w:lvlText w:val="%1."/>
+      <w:lvlJc w:val="left"/>
+      <w:pPr>
+        <w:ind w:left="720" w:hanging="360"/>
+      </w:pPr>
+      <w:rPr>
+        <w:rFonts w:hint="default"/>
+        <w:b/>
+      </w:rPr>
+    </w:lvl>
+    <w:lvl w:ilvl="1" w:tplc="240A0019" w:tentative="1">
+      <w:start w:val="1"/>
+      <w:numFmt w:val="lowerLetter"/>
+      <w:lvlText w:val="%2."/>
+      <w:lvlJc w:val="left"/>
+      <w:pPr>
+        <w:ind w:left="1440" w:hanging="360"/>
+      </w:pPr>
+    </w:lvl>
+    <w:lvl w:ilvl="2" w:tplc="240A001B" w:tentative="1">
+      <w:start w:val="1"/>
+      <w:numFmt w:val="lowerRoman"/>
+      <w:lvlText w:val="%3."/>
+      <w:lvlJc w:val="right"/>
+      <w:pPr>
+        <w:ind w:left="2160" w:hanging="180"/>
+      </w:pPr>
+    </w:lvl>
+    <w:lvl w:ilvl="3" w:tplc="240A000F" w:tentative="1">
+      <w:start w:val="1"/>
+      <w:numFmt w:val="decimal"/>
+      <w:lvlText w:val="%4."/>
+      <w:lvlJc w:val="left"/>
+      <w:pPr>
+        <w:ind w:left="2880" w:hanging="360"/>
+      </w:pPr>
+    </w:lvl>
+    <w:lvl w:ilvl="4" w:tplc="240A0019" w:tentative="1">
+      <w:start w:val="1"/>
+      <w:numFmt w:val="lowerLetter"/>
+      <w:lvlText w:val="%5."/>
+      <w:lvlJc w:val="left"/>
+      <w:pPr>
+        <w:ind w:left="3600" w:hanging="360"/>
+      </w:pPr>
+    </w:lvl>
+    <w:lvl w:ilvl="5" w:tplc="240A001B" w:tentative="1">
+      <w:start w:val="1"/>
+      <w:numFmt w:val="lowerRoman"/>
+      <w:lvlText w:val="%6."/>
+      <w:lvlJc w:val="right"/>
+      <w:pPr>
+        <w:ind w:left="4320" w:hanging="180"/>
+      </w:pPr>
+    </w:lvl>
+    <w:lvl w:ilvl="6" w:tplc="240A000F" w:tentative="1">
+      <w:start w:val="1"/>
+      <w:numFmt w:val="decimal"/>
+      <w:lvlText w:val="%7."/>
+      <w:lvlJc w:val="left"/>
+      <w:pPr>
+        <w:ind w:left="5040" w:hanging="360"/>
+      </w:pPr>
+    </w:lvl>
+    <w:lvl w:ilvl="7" w:tplc="240A0019" w:tentative="1">
+      <w:start w:val="1"/>
+      <w:numFmt w:val="lowerLetter"/>
+      <w:lvlText w:val="%8."/>
+      <w:lvlJc w:val="left"/>
+      <w:pPr>
+        <w:ind w:left="5760" w:hanging="360"/>
+      </w:pPr>
+    </w:lvl>
+    <w:lvl w:ilvl="8" w:tplc="240A001B" w:tentative="1">
+      <w:start w:val="1"/>
+      <w:numFmt w:val="lowerRoman"/>
+      <w:lvlText w:val="%9."/>
+      <w:lvlJc w:val="right"/>
+      <w:pPr>
+        <w:ind w:left="6480" w:hanging="180"/>
+      </w:pPr>
+    </w:lvl>
+  </w:abstractNum>
+  <w:abstractNum w:abstractNumId="9" w15:restartNumberingAfterBreak="0">
+    <w:nsid w:val="7C9A0580"/>
+    <w:multiLevelType w:val="hybridMultilevel"/>
+    <w:tmpl w:val="013220EA"/>
+    <w:lvl w:ilvl="0" w:tplc="99E45158">
+      <w:start w:val="1"/>
+      <w:numFmt w:val="decimal"/>
+      <w:lvlText w:val="%1."/>
+      <w:lvlJc w:val="left"/>
+      <w:pPr>
+        <w:ind w:left="1080" w:hanging="360"/>
+      </w:pPr>
+      <w:rPr>
+        <w:rFonts w:hint="default"/>
+        <w:b/>
+      </w:rPr>
+    </w:lvl>
+    <w:lvl w:ilvl="1" w:tplc="240A0019" w:tentative="1">
+      <w:start w:val="1"/>
+      <w:numFmt w:val="lowerLetter"/>
+      <w:lvlText w:val="%2."/>
+      <w:lvlJc w:val="left"/>
+      <w:pPr>
+        <w:ind w:left="1800" w:hanging="360"/>
+      </w:pPr>
+    </w:lvl>
+    <w:lvl w:ilvl="2" w:tplc="240A001B" w:tentative="1">
+      <w:start w:val="1"/>
+      <w:numFmt w:val="lowerRoman"/>
+      <w:lvlText w:val="%3."/>
+      <w:lvlJc w:val="right"/>
+      <w:pPr>
+        <w:ind w:left="2520" w:hanging="180"/>
+      </w:pPr>
+    </w:lvl>
+    <w:lvl w:ilvl="3" w:tplc="240A000F" w:tentative="1">
+      <w:start w:val="1"/>
+      <w:numFmt w:val="decimal"/>
+      <w:lvlText w:val="%4."/>
+      <w:lvlJc w:val="left"/>
+      <w:pPr>
+        <w:ind w:left="3240" w:hanging="360"/>
+      </w:pPr>
+    </w:lvl>
+    <w:lvl w:ilvl="4" w:tplc="240A0019" w:tentative="1">
+      <w:start w:val="1"/>
+      <w:numFmt w:val="lowerLetter"/>
+      <w:lvlText w:val="%5."/>
+      <w:lvlJc w:val="left"/>
+      <w:pPr>
+        <w:ind w:left="3960" w:hanging="360"/>
+      </w:pPr>
+    </w:lvl>
+    <w:lvl w:ilvl="5" w:tplc="240A001B" w:tentative="1">
+      <w:start w:val="1"/>
+      <w:numFmt w:val="lowerRoman"/>
+      <w:lvlText w:val="%6."/>
+      <w:lvlJc w:val="right"/>
+      <w:pPr>
+        <w:ind w:left="4680" w:hanging="180"/>
+      </w:pPr>
+    </w:lvl>
+    <w:lvl w:ilvl="6" w:tplc="240A000F" w:tentative="1">
+      <w:start w:val="1"/>
+      <w:numFmt w:val="decimal"/>
+      <w:lvlText w:val="%7."/>
+      <w:lvlJc w:val="left"/>
+      <w:pPr>
+        <w:ind w:left="5400" w:hanging="360"/>
+      </w:pPr>
+    </w:lvl>
+    <w:lvl w:ilvl="7" w:tplc="240A0019" w:tentative="1">
+      <w:start w:val="1"/>
+      <w:numFmt w:val="lowerLetter"/>
+      <w:lvlText w:val="%8."/>
+      <w:lvlJc w:val="left"/>
+      <w:pPr>
+        <w:ind w:left="6120" w:hanging="360"/>
+      </w:pPr>
+    </w:lvl>
+    <w:lvl w:ilvl="8" w:tplc="240A001B" w:tentative="1">
+      <w:start w:val="1"/>
+      <w:numFmt w:val="lowerRoman"/>
+      <w:lvlText w:val="%9."/>
+      <w:lvlJc w:val="right"/>
+      <w:pPr>
+        <w:ind w:left="6840" w:hanging="180"/>
+      </w:pPr>
+    </w:lvl>
+  </w:abstractNum>
   <w:num w:numId="1" w16cid:durableId="2071419230">
     <w:abstractNumId w:val="6"/>
   </w:num>
@@ -2451,6 +3159,12 @@
   </w:num>
   <w:num w:numId="8" w16cid:durableId="1560289884">
     <w:abstractNumId w:val="2"/>
+  </w:num>
+  <w:num w:numId="9" w16cid:durableId="1366322658">
+    <w:abstractNumId w:val="9"/>
+  </w:num>
+  <w:num w:numId="10" w16cid:durableId="1229457364">
+    <w:abstractNumId w:val="8"/>
   </w:num>
 </w:numbering>
 </file>

</xml_diff>